<commit_message>
Fix nested git repo and upload full project
</commit_message>
<xml_diff>
--- a/PhamDangKhoa_23653401_Tuan3/PhamDangKhoa_23653401_docs.docx
+++ b/PhamDangKhoa_23653401_Tuan3/PhamDangKhoa_23653401_docs.docx
@@ -13,6 +13,19 @@
       </w:r>
     </w:p>
     <w:p>
+      <w:r>
+        <w:t xml:space="preserve">Link github: </w:t>
+      </w:r>
+      <w:hyperlink r:id="rId5" w:history="1">
+        <w:r>
+          <w:rPr>
+            <w:rStyle w:val="Hyperlink"/>
+          </w:rPr>
+          <w:t>https://github.com/DangKhoa902/PhamDangKhoa_23653401/tree/main/PhamDangKhoa_23653401_Tuan3</w:t>
+        </w:r>
+      </w:hyperlink>
+    </w:p>
+    <w:p>
       <w:pPr>
         <w:pStyle w:val="Title"/>
       </w:pPr>
@@ -22,13 +35,7 @@
     </w:p>
     <w:p>
       <w:r>
-        <w:t>**Mục tiêu:** ghép 3 project `gio1`, `gio2`, `gio3` thành **1 màn hình Trang chủ** duy nhất, xếp đúng thứ tự: Header trên cùng → Category Chips → Lưới sách (có Badge) →</w:t>
-      </w:r>
-      <w:r>
-        <w:t xml:space="preserve"> </w:t>
-      </w:r>
-      <w:r>
-        <w:t>Floating Cart Button nổi ở góc.</w:t>
+        <w:t>**Mục tiêu:** ghép 3 project `gio1`, `gio2`, `gio3` thành **1 màn hình Trang chủ** duy nhất, xếp đúng thứ tự: Header trên cùng → Category Chips → Lưới sách (có Badge) → Floating Cart Button nổi ở góc.</w:t>
       </w:r>
     </w:p>
     <w:p>
@@ -50,6 +57,9 @@
     </w:p>
     <w:p>
       <w:r>
+        <w:rPr>
+          <w:noProof/>
+        </w:rPr>
         <w:drawing>
           <wp:inline distT="0" distB="0" distL="0" distR="0" wp14:anchorId="09DB5133" wp14:editId="76F611DD">
             <wp:extent cx="5943600" cy="3343275"/>
@@ -63,58 +73,6 @@
                 <pic:pic xmlns:pic="http://schemas.openxmlformats.org/drawingml/2006/picture">
                   <pic:nvPicPr>
                     <pic:cNvPr id="61597243" name=""/>
-                    <pic:cNvPicPr/>
-                  </pic:nvPicPr>
-                  <pic:blipFill>
-                    <a:blip r:embed="rId5"/>
-                    <a:stretch>
-                      <a:fillRect/>
-                    </a:stretch>
-                  </pic:blipFill>
-                  <pic:spPr>
-                    <a:xfrm>
-                      <a:off x="0" y="0"/>
-                      <a:ext cx="5943600" cy="3343275"/>
-                    </a:xfrm>
-                    <a:prstGeom prst="rect">
-                      <a:avLst/>
-                    </a:prstGeom>
-                  </pic:spPr>
-                </pic:pic>
-              </a:graphicData>
-            </a:graphic>
-          </wp:inline>
-        </w:drawing>
-      </w:r>
-    </w:p>
-    <w:p>
-      <w:pPr>
-        <w:pStyle w:val="Heading1"/>
-        <w:numPr>
-          <w:ilvl w:val="0"/>
-          <w:numId w:val="2"/>
-        </w:numPr>
-      </w:pPr>
-      <w:r>
-        <w:lastRenderedPageBreak/>
-        <w:t>Copy 5 file component, **giữ nguyên không sửa gì**:</w:t>
-      </w:r>
-    </w:p>
-    <w:p>
-      <w:r>
-        <w:drawing>
-          <wp:inline distT="0" distB="0" distL="0" distR="0" wp14:anchorId="75EC4198" wp14:editId="6F8E304A">
-            <wp:extent cx="5943600" cy="3343275"/>
-            <wp:effectExtent l="0" t="0" r="0" b="9525"/>
-            <wp:docPr id="1274367373" name="Picture 1"/>
-            <wp:cNvGraphicFramePr>
-              <a:graphicFrameLocks xmlns:a="http://schemas.openxmlformats.org/drawingml/2006/main" noChangeAspect="1"/>
-            </wp:cNvGraphicFramePr>
-            <a:graphic xmlns:a="http://schemas.openxmlformats.org/drawingml/2006/main">
-              <a:graphicData uri="http://schemas.openxmlformats.org/drawingml/2006/picture">
-                <pic:pic xmlns:pic="http://schemas.openxmlformats.org/drawingml/2006/picture">
-                  <pic:nvPicPr>
-                    <pic:cNvPr id="1274367373" name=""/>
                     <pic:cNvPicPr/>
                   </pic:nvPicPr>
                   <pic:blipFill>
@@ -148,16 +106,20 @@
         </w:numPr>
       </w:pPr>
       <w:r>
-        <w:t>Viết `App.tsx` mới, ráp theo đúng khung sau (điền phần `...`):</w:t>
-      </w:r>
-    </w:p>
-    <w:p>
-      <w:r>
+        <w:lastRenderedPageBreak/>
+        <w:t>Copy 5 file component, **giữ nguyên không sửa gì**:</w:t>
+      </w:r>
+    </w:p>
+    <w:p>
+      <w:r>
+        <w:rPr>
+          <w:noProof/>
+        </w:rPr>
         <w:drawing>
-          <wp:inline distT="0" distB="0" distL="0" distR="0" wp14:anchorId="775186C8" wp14:editId="12D2683C">
+          <wp:inline distT="0" distB="0" distL="0" distR="0" wp14:anchorId="75EC4198" wp14:editId="6F8E304A">
             <wp:extent cx="5943600" cy="3343275"/>
             <wp:effectExtent l="0" t="0" r="0" b="9525"/>
-            <wp:docPr id="1065241546" name="Picture 1"/>
+            <wp:docPr id="1274367373" name="Picture 1"/>
             <wp:cNvGraphicFramePr>
               <a:graphicFrameLocks xmlns:a="http://schemas.openxmlformats.org/drawingml/2006/main" noChangeAspect="1"/>
             </wp:cNvGraphicFramePr>
@@ -165,7 +127,7 @@
               <a:graphicData uri="http://schemas.openxmlformats.org/drawingml/2006/picture">
                 <pic:pic xmlns:pic="http://schemas.openxmlformats.org/drawingml/2006/picture">
                   <pic:nvPicPr>
-                    <pic:cNvPr id="1065241546" name=""/>
+                    <pic:cNvPr id="1274367373" name=""/>
                     <pic:cNvPicPr/>
                   </pic:nvPicPr>
                   <pic:blipFill>
@@ -191,18 +153,27 @@
       </w:r>
     </w:p>
     <w:p>
-      <w:r>
-        <w:t>Giao diện:</w:t>
-      </w:r>
-    </w:p>
-    <w:p>
-      <w:r>
-        <w:lastRenderedPageBreak/>
+      <w:pPr>
+        <w:pStyle w:val="Heading1"/>
+        <w:numPr>
+          <w:ilvl w:val="0"/>
+          <w:numId w:val="2"/>
+        </w:numPr>
+      </w:pPr>
+      <w:r>
+        <w:t>Viết `App.tsx` mới, ráp theo đúng khung sau (điền phần `...`):</w:t>
+      </w:r>
+    </w:p>
+    <w:p>
+      <w:r>
+        <w:rPr>
+          <w:noProof/>
+        </w:rPr>
         <w:drawing>
-          <wp:inline distT="0" distB="0" distL="0" distR="0" wp14:anchorId="37444F53" wp14:editId="166313D4">
+          <wp:inline distT="0" distB="0" distL="0" distR="0" wp14:anchorId="775186C8" wp14:editId="12D2683C">
             <wp:extent cx="5943600" cy="3343275"/>
             <wp:effectExtent l="0" t="0" r="0" b="9525"/>
-            <wp:docPr id="47494532" name="Picture 1"/>
+            <wp:docPr id="1065241546" name="Picture 1"/>
             <wp:cNvGraphicFramePr>
               <a:graphicFrameLocks xmlns:a="http://schemas.openxmlformats.org/drawingml/2006/main" noChangeAspect="1"/>
             </wp:cNvGraphicFramePr>
@@ -210,7 +181,7 @@
               <a:graphicData uri="http://schemas.openxmlformats.org/drawingml/2006/picture">
                 <pic:pic xmlns:pic="http://schemas.openxmlformats.org/drawingml/2006/picture">
                   <pic:nvPicPr>
-                    <pic:cNvPr id="47494532" name=""/>
+                    <pic:cNvPr id="1065241546" name=""/>
                     <pic:cNvPicPr/>
                   </pic:nvPicPr>
                   <pic:blipFill>
@@ -235,6 +206,54 @@
         </w:drawing>
       </w:r>
     </w:p>
+    <w:p>
+      <w:r>
+        <w:t>Giao diện:</w:t>
+      </w:r>
+    </w:p>
+    <w:p>
+      <w:r>
+        <w:rPr>
+          <w:noProof/>
+        </w:rPr>
+        <w:lastRenderedPageBreak/>
+        <w:drawing>
+          <wp:inline distT="0" distB="0" distL="0" distR="0" wp14:anchorId="37444F53" wp14:editId="166313D4">
+            <wp:extent cx="5943600" cy="3343275"/>
+            <wp:effectExtent l="0" t="0" r="0" b="9525"/>
+            <wp:docPr id="47494532" name="Picture 1"/>
+            <wp:cNvGraphicFramePr>
+              <a:graphicFrameLocks xmlns:a="http://schemas.openxmlformats.org/drawingml/2006/main" noChangeAspect="1"/>
+            </wp:cNvGraphicFramePr>
+            <a:graphic xmlns:a="http://schemas.openxmlformats.org/drawingml/2006/main">
+              <a:graphicData uri="http://schemas.openxmlformats.org/drawingml/2006/picture">
+                <pic:pic xmlns:pic="http://schemas.openxmlformats.org/drawingml/2006/picture">
+                  <pic:nvPicPr>
+                    <pic:cNvPr id="47494532" name=""/>
+                    <pic:cNvPicPr/>
+                  </pic:nvPicPr>
+                  <pic:blipFill>
+                    <a:blip r:embed="rId9"/>
+                    <a:stretch>
+                      <a:fillRect/>
+                    </a:stretch>
+                  </pic:blipFill>
+                  <pic:spPr>
+                    <a:xfrm>
+                      <a:off x="0" y="0"/>
+                      <a:ext cx="5943600" cy="3343275"/>
+                    </a:xfrm>
+                    <a:prstGeom prst="rect">
+                      <a:avLst/>
+                    </a:prstGeom>
+                  </pic:spPr>
+                </pic:pic>
+              </a:graphicData>
+            </a:graphic>
+          </wp:inline>
+        </w:drawing>
+      </w:r>
+    </w:p>
     <w:p/>
     <w:p>
       <w:r>
@@ -266,6 +285,9 @@
     </w:p>
     <w:p>
       <w:r>
+        <w:rPr>
+          <w:noProof/>
+        </w:rPr>
         <w:lastRenderedPageBreak/>
         <w:drawing>
           <wp:inline distT="0" distB="0" distL="0" distR="0" wp14:anchorId="161487FB" wp14:editId="1C405B43">
@@ -283,7 +305,7 @@
                     <pic:cNvPicPr/>
                   </pic:nvPicPr>
                   <pic:blipFill>
-                    <a:blip r:embed="rId9"/>
+                    <a:blip r:embed="rId10"/>
                     <a:stretch>
                       <a:fillRect/>
                     </a:stretch>
@@ -1219,6 +1241,7 @@
   <w:style w:type="character" w:default="1" w:styleId="DefaultParagraphFont">
     <w:name w:val="Default Paragraph Font"/>
     <w:uiPriority w:val="1"/>
+    <w:semiHidden/>
     <w:unhideWhenUsed/>
   </w:style>
   <w:style w:type="table" w:default="1" w:styleId="TableNormal">
@@ -1530,6 +1553,29 @@
       <w:smallCaps/>
       <w:color w:val="2E74B5" w:themeColor="accent1" w:themeShade="BF"/>
       <w:spacing w:val="5"/>
+    </w:rPr>
+  </w:style>
+  <w:style w:type="character" w:styleId="Hyperlink">
+    <w:name w:val="Hyperlink"/>
+    <w:basedOn w:val="DefaultParagraphFont"/>
+    <w:uiPriority w:val="99"/>
+    <w:unhideWhenUsed/>
+    <w:rsid w:val="00F10926"/>
+    <w:rPr>
+      <w:color w:val="0563C1" w:themeColor="hyperlink"/>
+      <w:u w:val="single"/>
+    </w:rPr>
+  </w:style>
+  <w:style w:type="character" w:styleId="UnresolvedMention">
+    <w:name w:val="Unresolved Mention"/>
+    <w:basedOn w:val="DefaultParagraphFont"/>
+    <w:uiPriority w:val="99"/>
+    <w:semiHidden/>
+    <w:unhideWhenUsed/>
+    <w:rsid w:val="00F10926"/>
+    <w:rPr>
+      <w:color w:val="605E5C"/>
+      <w:shd w:val="clear" w:color="auto" w:fill="E1DFDD"/>
     </w:rPr>
   </w:style>
 </w:styles>

</xml_diff>